<commit_message>
Nomor halaman di kaki, tanpa nomor di sampul
Daftar isi menyebut nomor halaman, sedangkan halamannya sendiri tidak
bernomor. Daftar yang menunjuk "halaman 16" tidak berguna kalau pembacanya
tidak bisa menemukan halaman 16.

Nomornya ditulis sebagai FIELD Word, bukan angka mati, jadi Word yang
menghitung dan tetap benar bila isinya bergeser. Sampul dikecualikan lewat
different_first_page.

Penomorannya menerus dari sampul, bukan angka Romawi terpisah untuk bagian
depan. Alasannya praktis: angka yang tercetak jadi sama persis dengan angka
yang diukur 25_daftar_isi.py, sehingga daftar isi tidak perlu dihitung ulang
dengan dua sistem penomoran.

Diuji silang seluruh entri daftar isi, daftar gambar, dan daftar tabel
terhadap teks PDF: nol entri meleset. Tiap entri menunjuk halaman yang
benar-benar memuatnya.

29 halaman dari batas 30.

Co-Authored-By: Claude Opus 5 <noreply@anthropic.com>
Claude-Session: https://claude.ai/code/session_012kjvfs94bd9SUHSd9yFR3f
</commit_message>
<xml_diff>
--- a/Anforcom2026_DSDC_TrioLaAlbiceleste_PasangSurut.docx
+++ b/Anforcom2026_DSDC_TrioLaAlbiceleste_PasangSurut.docx
@@ -4594,7 +4594,7 @@
                     <pic:cNvPicPr/>
                   </pic:nvPicPr>
                   <pic:blipFill>
-                    <a:blip r:embed="rId9"/>
+                    <a:blip r:embed="rId10"/>
                     <a:stretch>
                       <a:fillRect/>
                     </a:stretch>
@@ -9793,7 +9793,7 @@
                     <pic:cNvPicPr/>
                   </pic:nvPicPr>
                   <pic:blipFill>
-                    <a:blip r:embed="rId10"/>
+                    <a:blip r:embed="rId11"/>
                     <a:stretch>
                       <a:fillRect/>
                     </a:stretch>
@@ -9866,67 +9866,6 @@
                 <pic:pic>
                   <pic:nvPicPr>
                     <pic:cNvPr id="0" name="02_rute_dan_peringatan.jpg"/>
-                    <pic:cNvPicPr/>
-                  </pic:nvPicPr>
-                  <pic:blipFill>
-                    <a:blip r:embed="rId11"/>
-                    <a:stretch>
-                      <a:fillRect/>
-                    </a:stretch>
-                  </pic:blipFill>
-                  <pic:spPr>
-                    <a:xfrm>
-                      <a:off x="0" y="0"/>
-                      <a:ext cx="5040000" cy="2481429"/>
-                    </a:xfrm>
-                    <a:prstGeom prst="rect"/>
-                  </pic:spPr>
-                </pic:pic>
-              </a:graphicData>
-            </a:graphic>
-          </wp:inline>
-        </w:drawing>
-      </w:r>
-    </w:p>
-    <w:p>
-      <w:pPr>
-        <w:jc w:val="both"/>
-      </w:pPr>
-      <w:r>
-        <w:rPr>
-          <w:rFonts w:ascii="Times New Roman" w:hAnsi="Times New Roman"/>
-          <w:b/>
-          <w:sz w:val="24"/>
-        </w:rPr>
-        <w:t>Gambar 3.</w:t>
-      </w:r>
-      <w:r>
-        <w:rPr>
-          <w:rFonts w:ascii="Times New Roman" w:hAnsi="Times New Roman"/>
-          <w:sz w:val="24"/>
-        </w:rPr>
-        <w:t xml:space="preserve"> Rute dan peringatan paparan. Rute sadar rob digambar ambar di atas peta biru, mengikuti konvensi navigasi laut. Panel kiri memuat waktu tempuh, jarak, jumlah ruas dilewati, dan jumlah ruas tergenang. Peringatan paparan terbit karena rute menembus genangan di atas ambang moda, lengkap dengan kedalaman, nama ruas, dan jamnya.</w:t>
-      </w:r>
-    </w:p>
-    <w:p>
-      <w:pPr>
-        <w:spacing w:after="60"/>
-        <w:ind w:firstLine="0"/>
-        <w:jc w:val="center"/>
-      </w:pPr>
-      <w:r>
-        <w:drawing>
-          <wp:inline xmlns:a="http://schemas.openxmlformats.org/drawingml/2006/main" xmlns:pic="http://schemas.openxmlformats.org/drawingml/2006/picture">
-            <wp:extent cx="5040000" cy="2481429"/>
-            <wp:docPr id="4" name="Picture 4"/>
-            <wp:cNvGraphicFramePr>
-              <a:graphicFrameLocks noChangeAspect="1"/>
-            </wp:cNvGraphicFramePr>
-            <a:graphic>
-              <a:graphicData uri="http://schemas.openxmlformats.org/drawingml/2006/picture">
-                <pic:pic>
-                  <pic:nvPicPr>
-                    <pic:cNvPr id="0" name="03_selisih_rute.jpg"/>
                     <pic:cNvPicPr/>
                   </pic:nvPicPr>
                   <pic:blipFill>
@@ -9959,6 +9898,67 @@
           <w:b/>
           <w:sz w:val="24"/>
         </w:rPr>
+        <w:t>Gambar 3.</w:t>
+      </w:r>
+      <w:r>
+        <w:rPr>
+          <w:rFonts w:ascii="Times New Roman" w:hAnsi="Times New Roman"/>
+          <w:sz w:val="24"/>
+        </w:rPr>
+        <w:t xml:space="preserve"> Rute dan peringatan paparan. Rute sadar rob digambar ambar di atas peta biru, mengikuti konvensi navigasi laut. Panel kiri memuat waktu tempuh, jarak, jumlah ruas dilewati, dan jumlah ruas tergenang. Peringatan paparan terbit karena rute menembus genangan di atas ambang moda, lengkap dengan kedalaman, nama ruas, dan jamnya.</w:t>
+      </w:r>
+    </w:p>
+    <w:p>
+      <w:pPr>
+        <w:spacing w:after="60"/>
+        <w:ind w:firstLine="0"/>
+        <w:jc w:val="center"/>
+      </w:pPr>
+      <w:r>
+        <w:drawing>
+          <wp:inline xmlns:a="http://schemas.openxmlformats.org/drawingml/2006/main" xmlns:pic="http://schemas.openxmlformats.org/drawingml/2006/picture">
+            <wp:extent cx="5040000" cy="2481429"/>
+            <wp:docPr id="4" name="Picture 4"/>
+            <wp:cNvGraphicFramePr>
+              <a:graphicFrameLocks noChangeAspect="1"/>
+            </wp:cNvGraphicFramePr>
+            <a:graphic>
+              <a:graphicData uri="http://schemas.openxmlformats.org/drawingml/2006/picture">
+                <pic:pic>
+                  <pic:nvPicPr>
+                    <pic:cNvPr id="0" name="03_selisih_rute.jpg"/>
+                    <pic:cNvPicPr/>
+                  </pic:nvPicPr>
+                  <pic:blipFill>
+                    <a:blip r:embed="rId13"/>
+                    <a:stretch>
+                      <a:fillRect/>
+                    </a:stretch>
+                  </pic:blipFill>
+                  <pic:spPr>
+                    <a:xfrm>
+                      <a:off x="0" y="0"/>
+                      <a:ext cx="5040000" cy="2481429"/>
+                    </a:xfrm>
+                    <a:prstGeom prst="rect"/>
+                  </pic:spPr>
+                </pic:pic>
+              </a:graphicData>
+            </a:graphic>
+          </wp:inline>
+        </w:drawing>
+      </w:r>
+    </w:p>
+    <w:p>
+      <w:pPr>
+        <w:jc w:val="both"/>
+      </w:pPr>
+      <w:r>
+        <w:rPr>
+          <w:rFonts w:ascii="Times New Roman" w:hAnsi="Times New Roman"/>
+          <w:b/>
+          <w:sz w:val="24"/>
+        </w:rPr>
         <w:t>Gambar 4.</w:t>
       </w:r>
       <w:r>
@@ -9991,7 +9991,7 @@
                     <pic:cNvPicPr/>
                   </pic:nvPicPr>
                   <pic:blipFill>
-                    <a:blip r:embed="rId13"/>
+                    <a:blip r:embed="rId14"/>
                     <a:stretch>
                       <a:fillRect/>
                     </a:stretch>
@@ -10052,7 +10052,7 @@
                     <pic:cNvPicPr/>
                   </pic:nvPicPr>
                   <pic:blipFill>
-                    <a:blip r:embed="rId14"/>
+                    <a:blip r:embed="rId15"/>
                     <a:stretch>
                       <a:fillRect/>
                     </a:stretch>
@@ -10113,7 +10113,7 @@
                     <pic:cNvPicPr/>
                   </pic:nvPicPr>
                   <pic:blipFill>
-                    <a:blip r:embed="rId15"/>
+                    <a:blip r:embed="rId16"/>
                     <a:stretch>
                       <a:fillRect/>
                     </a:stretch>
@@ -10174,7 +10174,7 @@
                     <pic:cNvPicPr/>
                   </pic:nvPicPr>
                   <pic:blipFill>
-                    <a:blip r:embed="rId16"/>
+                    <a:blip r:embed="rId17"/>
                     <a:stretch>
                       <a:fillRect/>
                     </a:stretch>
@@ -10235,7 +10235,7 @@
                     <pic:cNvPicPr/>
                   </pic:nvPicPr>
                   <pic:blipFill>
-                    <a:blip r:embed="rId17"/>
+                    <a:blip r:embed="rId18"/>
                     <a:stretch>
                       <a:fillRect/>
                     </a:stretch>
@@ -12930,13 +12930,36 @@
     </w:tbl>
     <w:p/>
     <w:sectPr>
+      <w:footerReference w:type="default" r:id="rId9"/>
       <w:pgSz w:w="11906" w:h="16838"/>
       <w:pgMar w:top="1701" w:right="1701" w:bottom="1701" w:left="2268" w:header="720" w:footer="720" w:gutter="0"/>
       <w:cols w:space="720"/>
+      <w:titlePg/>
       <w:docGrid w:linePitch="360"/>
     </w:sectPr>
   </w:body>
 </w:document>
+</file>
+
+<file path=word/footer1.xml><?xml version="1.0" encoding="utf-8"?>
+<w:ftr xmlns:m="http://schemas.openxmlformats.org/officeDocument/2006/math" xmlns:mc="http://schemas.openxmlformats.org/markup-compatibility/2006" xmlns:mo="http://schemas.microsoft.com/office/mac/office/2008/main" xmlns:mv="urn:schemas-microsoft-com:mac:vml" xmlns:o="urn:schemas-microsoft-com:office:office" xmlns:r="http://schemas.openxmlformats.org/officeDocument/2006/relationships" xmlns:v="urn:schemas-microsoft-com:vml" xmlns:w10="urn:schemas-microsoft-com:office:word" xmlns:w14="http://schemas.microsoft.com/office/word/2010/wordml" xmlns:w="http://schemas.openxmlformats.org/wordprocessingml/2006/main" xmlns:wne="http://schemas.microsoft.com/office/word/2006/wordml" xmlns:wp14="http://schemas.microsoft.com/office/word/2010/wordprocessingDrawing" xmlns:wp="http://schemas.openxmlformats.org/drawingml/2006/wordprocessingDrawing" xmlns:wpc="http://schemas.microsoft.com/office/word/2010/wordprocessingCanvas" xmlns:wpg="http://schemas.microsoft.com/office/word/2010/wordprocessingGroup" xmlns:wpi="http://schemas.microsoft.com/office/word/2010/wordprocessingInk" xmlns:wps="http://schemas.microsoft.com/office/word/2010/wordprocessingShape" mc:Ignorable="w14 wp14">
+  <w:p>
+    <w:pPr>
+      <w:pStyle w:val="Footer"/>
+      <w:ind w:firstLine="0"/>
+      <w:jc w:val="center"/>
+    </w:pPr>
+    <w:r>
+      <w:rPr>
+        <w:rFonts w:ascii="Times New Roman" w:hAnsi="Times New Roman"/>
+        <w:sz w:val="22"/>
+      </w:rPr>
+      <w:fldChar w:fldCharType="begin"/>
+      <w:instrText xml:space="preserve"> PAGE </w:instrText>
+      <w:fldChar w:fldCharType="end"/>
+    </w:r>
+  </w:p>
+</w:ftr>
 </file>
 
 <file path=word/numbering.xml><?xml version="1.0" encoding="utf-8"?>

</xml_diff>